<commit_message>
feat: documentos de submissão
</commit_message>
<xml_diff>
--- a/public/submissao/submissão_de_obras.docx
+++ b/public/submissao/submissão_de_obras.docx
@@ -957,8 +957,9 @@
           <w:sz w:val="22"/>
           <w:szCs w:val="22"/>
         </w:rPr>
-        <w:t xml:space="preserve"> à Sandbr, que l</w:t>
-      </w:r>
+        <w:t xml:space="preserve"> à </w:t>
+      </w:r>
+      <w:proofErr w:type="spellStart"/>
       <w:r>
         <w:rPr>
           <w:rFonts w:ascii="Averia Serif Libre" w:hAnsi="Averia Serif Libre"/>
@@ -967,8 +968,9 @@
           <w:sz w:val="22"/>
           <w:szCs w:val="22"/>
         </w:rPr>
-        <w:t>icencia</w:t>
-      </w:r>
+        <w:t>Sandbr</w:t>
+      </w:r>
+      <w:proofErr w:type="spellEnd"/>
       <w:r>
         <w:rPr>
           <w:rFonts w:ascii="Averia Serif Libre" w:hAnsi="Averia Serif Libre"/>
@@ -977,7 +979,7 @@
           <w:sz w:val="22"/>
           <w:szCs w:val="22"/>
         </w:rPr>
-        <w:t>rá essa</w:t>
+        <w:t>, que l</w:t>
       </w:r>
       <w:r>
         <w:rPr>
@@ -987,7 +989,7 @@
           <w:sz w:val="22"/>
           <w:szCs w:val="22"/>
         </w:rPr>
-        <w:t xml:space="preserve"> sob </w:t>
+        <w:t>icencia</w:t>
       </w:r>
       <w:r>
         <w:rPr>
@@ -997,7 +999,7 @@
           <w:sz w:val="22"/>
           <w:szCs w:val="22"/>
         </w:rPr>
-        <w:t xml:space="preserve">a </w:t>
+        <w:t>rá essa</w:t>
       </w:r>
       <w:r>
         <w:rPr>
@@ -1007,7 +1009,7 @@
           <w:sz w:val="22"/>
           <w:szCs w:val="22"/>
         </w:rPr>
-        <w:t>CC BY-NC-ND (Atribuição - Não Comercial - Sem Derivações)</w:t>
+        <w:t xml:space="preserve"> sob </w:t>
       </w:r>
       <w:r>
         <w:rPr>
@@ -1017,6 +1019,26 @@
           <w:sz w:val="22"/>
           <w:szCs w:val="22"/>
         </w:rPr>
+        <w:t xml:space="preserve">a </w:t>
+      </w:r>
+      <w:r>
+        <w:rPr>
+          <w:rFonts w:ascii="Averia Serif Libre" w:hAnsi="Averia Serif Libre"/>
+          <w:i/>
+          <w:iCs/>
+          <w:sz w:val="22"/>
+          <w:szCs w:val="22"/>
+        </w:rPr>
+        <w:t>CC BY-NC-ND (Atribuição - Não Comercial - Sem Derivações)</w:t>
+      </w:r>
+      <w:r>
+        <w:rPr>
+          <w:rFonts w:ascii="Averia Serif Libre" w:hAnsi="Averia Serif Libre"/>
+          <w:i/>
+          <w:iCs/>
+          <w:sz w:val="22"/>
+          <w:szCs w:val="22"/>
+        </w:rPr>
         <w:t>.</w:t>
       </w:r>
     </w:p>
@@ -1293,7 +1315,16 @@
           <w:sz w:val="22"/>
           <w:szCs w:val="22"/>
         </w:rPr>
-        <w:t xml:space="preserve"> da obra acima mencionada ou que possuo os direitos necessários para ceder à Sandb</w:t>
+        <w:t xml:space="preserve"> da obra acima mencionada ou que possuo os direitos necessários para ceder à </w:t>
+      </w:r>
+      <w:proofErr w:type="spellStart"/>
+      <w:r>
+        <w:rPr>
+          <w:rFonts w:ascii="Averia Serif Libre" w:hAnsi="Averia Serif Libre"/>
+          <w:sz w:val="22"/>
+          <w:szCs w:val="22"/>
+        </w:rPr>
+        <w:t>Sandb</w:t>
       </w:r>
       <w:r>
         <w:rPr>
@@ -1303,6 +1334,7 @@
         </w:rPr>
         <w:t>r</w:t>
       </w:r>
+      <w:proofErr w:type="spellEnd"/>
       <w:r>
         <w:rPr>
           <w:rFonts w:ascii="Averia Serif Libre" w:hAnsi="Averia Serif Libre"/>
@@ -1418,7 +1450,43 @@
           <w:sz w:val="22"/>
           <w:szCs w:val="22"/>
         </w:rPr>
-        <w:t>Caso eu forneça informações falsas ou enganosas neste documento, assumo total responsabilidade legal sobre qualquer litígio, reivindicação ou disputa relacionada à obra enviada, isentando a Sandbr de qualquer responsabilidade. Reconheço que a falsificação ou omissão de informações pode resultar na remoção da obra e no término de qualquer colaboração com a Sandbr.</w:t>
+        <w:t xml:space="preserve">Caso eu forneça informações falsas ou enganosas neste documento, assumo total responsabilidade legal sobre qualquer litígio, reivindicação ou disputa relacionada à obra enviada, isentando a </w:t>
+      </w:r>
+      <w:proofErr w:type="spellStart"/>
+      <w:r>
+        <w:rPr>
+          <w:rFonts w:ascii="Averia Serif Libre" w:hAnsi="Averia Serif Libre"/>
+          <w:sz w:val="22"/>
+          <w:szCs w:val="22"/>
+        </w:rPr>
+        <w:t>Sandbr</w:t>
+      </w:r>
+      <w:proofErr w:type="spellEnd"/>
+      <w:r>
+        <w:rPr>
+          <w:rFonts w:ascii="Averia Serif Libre" w:hAnsi="Averia Serif Libre"/>
+          <w:sz w:val="22"/>
+          <w:szCs w:val="22"/>
+        </w:rPr>
+        <w:t xml:space="preserve"> de qualquer responsabilidade. Reconheço que a falsificação ou omissão de informações pode resultar na remoção da obra e no término de qualquer colaboração com a </w:t>
+      </w:r>
+      <w:proofErr w:type="spellStart"/>
+      <w:r>
+        <w:rPr>
+          <w:rFonts w:ascii="Averia Serif Libre" w:hAnsi="Averia Serif Libre"/>
+          <w:sz w:val="22"/>
+          <w:szCs w:val="22"/>
+        </w:rPr>
+        <w:t>Sandbr</w:t>
+      </w:r>
+      <w:proofErr w:type="spellEnd"/>
+      <w:r>
+        <w:rPr>
+          <w:rFonts w:ascii="Averia Serif Libre" w:hAnsi="Averia Serif Libre"/>
+          <w:sz w:val="22"/>
+          <w:szCs w:val="22"/>
+        </w:rPr>
+        <w:t>.</w:t>
       </w:r>
     </w:p>
     <w:p>
@@ -1503,41 +1571,77 @@
           <w:sz w:val="22"/>
           <w:szCs w:val="22"/>
         </w:rPr>
-        <w:t>por meio deste documento, concordo que, caso eu não forneça uma licença específica para a obra enviada, a Sandbr poderá automaticamente licenciar minha obra sob a licença CC BY-NC-ND (Atribuição - Não Comercial - Sem Derivações).</w:t>
-      </w:r>
-    </w:p>
-    <w:p>
-      <w:pPr>
-        <w:tabs>
-          <w:tab w:val="left" w:pos="5445"/>
-        </w:tabs>
-        <w:spacing w:after="0" w:line="240" w:lineRule="auto"/>
-        <w:rPr>
-          <w:rFonts w:ascii="Averia Serif Libre" w:hAnsi="Averia Serif Libre"/>
-          <w:sz w:val="22"/>
-          <w:szCs w:val="22"/>
-        </w:rPr>
-      </w:pPr>
-    </w:p>
-    <w:p>
-      <w:pPr>
-        <w:tabs>
-          <w:tab w:val="left" w:pos="5445"/>
-        </w:tabs>
-        <w:spacing w:after="0" w:line="240" w:lineRule="auto"/>
-        <w:rPr>
-          <w:rFonts w:ascii="Averia Serif Libre" w:hAnsi="Averia Serif Libre"/>
-          <w:sz w:val="22"/>
-          <w:szCs w:val="22"/>
-        </w:rPr>
-      </w:pPr>
-      <w:r>
-        <w:rPr>
-          <w:rFonts w:ascii="Averia Serif Libre" w:hAnsi="Averia Serif Libre"/>
-          <w:sz w:val="22"/>
-          <w:szCs w:val="22"/>
-        </w:rPr>
-        <w:t xml:space="preserve">Reconheço que, ao não especificar uma licença, estou permitindo que a Sandbr utilize a obra em seu site de acordo com os termos da licença CC BY-NC-ND, o que </w:t>
+        <w:t xml:space="preserve">por meio deste documento, concordo que, caso eu não forneça uma licença específica para a obra enviada, a </w:t>
+      </w:r>
+      <w:proofErr w:type="spellStart"/>
+      <w:r>
+        <w:rPr>
+          <w:rFonts w:ascii="Averia Serif Libre" w:hAnsi="Averia Serif Libre"/>
+          <w:sz w:val="22"/>
+          <w:szCs w:val="22"/>
+        </w:rPr>
+        <w:t>Sandbr</w:t>
+      </w:r>
+      <w:proofErr w:type="spellEnd"/>
+      <w:r>
+        <w:rPr>
+          <w:rFonts w:ascii="Averia Serif Libre" w:hAnsi="Averia Serif Libre"/>
+          <w:sz w:val="22"/>
+          <w:szCs w:val="22"/>
+        </w:rPr>
+        <w:t xml:space="preserve"> poderá automaticamente licenciar minha obra sob a licença CC BY-NC-ND (Atribuição - Não Comercial - Sem Derivações).</w:t>
+      </w:r>
+    </w:p>
+    <w:p>
+      <w:pPr>
+        <w:tabs>
+          <w:tab w:val="left" w:pos="5445"/>
+        </w:tabs>
+        <w:spacing w:after="0" w:line="240" w:lineRule="auto"/>
+        <w:rPr>
+          <w:rFonts w:ascii="Averia Serif Libre" w:hAnsi="Averia Serif Libre"/>
+          <w:sz w:val="22"/>
+          <w:szCs w:val="22"/>
+        </w:rPr>
+      </w:pPr>
+    </w:p>
+    <w:p>
+      <w:pPr>
+        <w:tabs>
+          <w:tab w:val="left" w:pos="5445"/>
+        </w:tabs>
+        <w:spacing w:after="0" w:line="240" w:lineRule="auto"/>
+        <w:rPr>
+          <w:rFonts w:ascii="Averia Serif Libre" w:hAnsi="Averia Serif Libre"/>
+          <w:sz w:val="22"/>
+          <w:szCs w:val="22"/>
+        </w:rPr>
+      </w:pPr>
+      <w:r>
+        <w:rPr>
+          <w:rFonts w:ascii="Averia Serif Libre" w:hAnsi="Averia Serif Libre"/>
+          <w:sz w:val="22"/>
+          <w:szCs w:val="22"/>
+        </w:rPr>
+        <w:t xml:space="preserve">Reconheço que, ao não especificar uma licença, estou permitindo que a </w:t>
+      </w:r>
+      <w:proofErr w:type="spellStart"/>
+      <w:r>
+        <w:rPr>
+          <w:rFonts w:ascii="Averia Serif Libre" w:hAnsi="Averia Serif Libre"/>
+          <w:sz w:val="22"/>
+          <w:szCs w:val="22"/>
+        </w:rPr>
+        <w:t>Sandbr</w:t>
+      </w:r>
+      <w:proofErr w:type="spellEnd"/>
+      <w:r>
+        <w:rPr>
+          <w:rFonts w:ascii="Averia Serif Libre" w:hAnsi="Averia Serif Libre"/>
+          <w:sz w:val="22"/>
+          <w:szCs w:val="22"/>
+        </w:rPr>
+        <w:t xml:space="preserve"> utilize a obra em seu site de acordo com os termos da licença CC BY-NC-ND, o que </w:t>
       </w:r>
       <w:r>
         <w:rPr>
@@ -1562,7 +1666,25 @@
           <w:sz w:val="22"/>
           <w:szCs w:val="22"/>
         </w:rPr>
-        <w:t xml:space="preserve">. Declaro estar ciente de que essa licença se aplicará enquanto minha obra permanecer disponível no site da Sandbr </w:t>
+        <w:t xml:space="preserve">. Declaro estar ciente de que essa licença se aplicará enquanto minha obra permanecer disponível no site da </w:t>
+      </w:r>
+      <w:proofErr w:type="spellStart"/>
+      <w:r>
+        <w:rPr>
+          <w:rFonts w:ascii="Averia Serif Libre" w:hAnsi="Averia Serif Libre"/>
+          <w:sz w:val="22"/>
+          <w:szCs w:val="22"/>
+        </w:rPr>
+        <w:t>Sandbr</w:t>
+      </w:r>
+      <w:proofErr w:type="spellEnd"/>
+      <w:r>
+        <w:rPr>
+          <w:rFonts w:ascii="Averia Serif Libre" w:hAnsi="Averia Serif Libre"/>
+          <w:sz w:val="22"/>
+          <w:szCs w:val="22"/>
+        </w:rPr>
+        <w:t xml:space="preserve"> </w:t>
       </w:r>
       <w:r>
         <w:rPr>
@@ -1725,42 +1847,79 @@
           <w:sz w:val="22"/>
           <w:szCs w:val="22"/>
         </w:rPr>
-        <w:t>comprometo-me a notificar a Sandbr imediatamente caso haja qualquer alteração nos termos de licenciamento da obra enviada, seja no que diz respeito à licença previamente escolhida ou qualquer mudança relacionada aos direitos de uso da obra.</w:t>
-      </w:r>
-    </w:p>
-    <w:p>
-      <w:pPr>
-        <w:tabs>
-          <w:tab w:val="left" w:pos="5445"/>
-        </w:tabs>
-        <w:spacing w:after="0" w:line="240" w:lineRule="auto"/>
-        <w:rPr>
-          <w:rFonts w:ascii="Averia Serif Libre" w:hAnsi="Averia Serif Libre"/>
-          <w:sz w:val="22"/>
-          <w:szCs w:val="22"/>
-        </w:rPr>
-      </w:pPr>
-    </w:p>
-    <w:p>
-      <w:pPr>
-        <w:tabs>
-          <w:tab w:val="left" w:pos="5445"/>
-        </w:tabs>
-        <w:spacing w:after="0" w:line="240" w:lineRule="auto"/>
-        <w:rPr>
-          <w:rFonts w:ascii="Averia Serif Libre" w:hAnsi="Averia Serif Libre"/>
-          <w:sz w:val="22"/>
-          <w:szCs w:val="22"/>
-        </w:rPr>
-      </w:pPr>
-      <w:r>
-        <w:rPr>
-          <w:rFonts w:ascii="Averia Serif Libre" w:hAnsi="Averia Serif Libre"/>
-          <w:sz w:val="22"/>
-          <w:szCs w:val="22"/>
-        </w:rPr>
-        <w:t xml:space="preserve">Reconheço que a falta de notificação à Sandbr sobre essas alterações poderá resultar em complicações no uso da obra no site, podendo a </w:t>
-      </w:r>
+        <w:t xml:space="preserve">comprometo-me a notificar a </w:t>
+      </w:r>
+      <w:proofErr w:type="spellStart"/>
+      <w:r>
+        <w:rPr>
+          <w:rFonts w:ascii="Averia Serif Libre" w:hAnsi="Averia Serif Libre"/>
+          <w:sz w:val="22"/>
+          <w:szCs w:val="22"/>
+        </w:rPr>
+        <w:t>Sandbr</w:t>
+      </w:r>
+      <w:proofErr w:type="spellEnd"/>
+      <w:r>
+        <w:rPr>
+          <w:rFonts w:ascii="Averia Serif Libre" w:hAnsi="Averia Serif Libre"/>
+          <w:sz w:val="22"/>
+          <w:szCs w:val="22"/>
+        </w:rPr>
+        <w:t xml:space="preserve"> imediatamente caso haja qualquer alteração nos termos de licenciamento da obra enviada, seja no que diz respeito à licença previamente escolhida ou qualquer mudança relacionada aos direitos de uso da obra.</w:t>
+      </w:r>
+    </w:p>
+    <w:p>
+      <w:pPr>
+        <w:tabs>
+          <w:tab w:val="left" w:pos="5445"/>
+        </w:tabs>
+        <w:spacing w:after="0" w:line="240" w:lineRule="auto"/>
+        <w:rPr>
+          <w:rFonts w:ascii="Averia Serif Libre" w:hAnsi="Averia Serif Libre"/>
+          <w:sz w:val="22"/>
+          <w:szCs w:val="22"/>
+        </w:rPr>
+      </w:pPr>
+    </w:p>
+    <w:p>
+      <w:pPr>
+        <w:tabs>
+          <w:tab w:val="left" w:pos="5445"/>
+        </w:tabs>
+        <w:spacing w:after="0" w:line="240" w:lineRule="auto"/>
+        <w:rPr>
+          <w:rFonts w:ascii="Averia Serif Libre" w:hAnsi="Averia Serif Libre"/>
+          <w:sz w:val="22"/>
+          <w:szCs w:val="22"/>
+        </w:rPr>
+      </w:pPr>
+      <w:r>
+        <w:rPr>
+          <w:rFonts w:ascii="Averia Serif Libre" w:hAnsi="Averia Serif Libre"/>
+          <w:sz w:val="22"/>
+          <w:szCs w:val="22"/>
+        </w:rPr>
+        <w:t xml:space="preserve">Reconheço que a falta de notificação à </w:t>
+      </w:r>
+      <w:proofErr w:type="spellStart"/>
+      <w:r>
+        <w:rPr>
+          <w:rFonts w:ascii="Averia Serif Libre" w:hAnsi="Averia Serif Libre"/>
+          <w:sz w:val="22"/>
+          <w:szCs w:val="22"/>
+        </w:rPr>
+        <w:t>Sandbr</w:t>
+      </w:r>
+      <w:proofErr w:type="spellEnd"/>
+      <w:r>
+        <w:rPr>
+          <w:rFonts w:ascii="Averia Serif Libre" w:hAnsi="Averia Serif Libre"/>
+          <w:sz w:val="22"/>
+          <w:szCs w:val="22"/>
+        </w:rPr>
+        <w:t xml:space="preserve"> sobre essas alterações poderá resultar em complicações no uso da obra no site, podendo a </w:t>
+      </w:r>
+      <w:proofErr w:type="gramStart"/>
       <w:r>
         <w:rPr>
           <w:rFonts w:ascii="Averia Serif Libre" w:hAnsi="Averia Serif Libre"/>
@@ -1777,13 +1936,32 @@
         </w:rPr>
         <w:t>a ser</w:t>
       </w:r>
-      <w:r>
-        <w:rPr>
-          <w:rFonts w:ascii="Averia Serif Libre" w:hAnsi="Averia Serif Libre"/>
-          <w:sz w:val="22"/>
-          <w:szCs w:val="22"/>
-        </w:rPr>
-        <w:t xml:space="preserve"> removida ou sofrer ajustes, conforme as novas condições de licenciamento. A Sandbr não será responsável por qualquer uso inadequado da obra caso o artista não forneça essa notificação.</w:t>
+      <w:proofErr w:type="gramEnd"/>
+      <w:r>
+        <w:rPr>
+          <w:rFonts w:ascii="Averia Serif Libre" w:hAnsi="Averia Serif Libre"/>
+          <w:sz w:val="22"/>
+          <w:szCs w:val="22"/>
+        </w:rPr>
+        <w:t xml:space="preserve"> removida ou sofrer ajustes, conforme as novas condições de licenciamento. A </w:t>
+      </w:r>
+      <w:proofErr w:type="spellStart"/>
+      <w:r>
+        <w:rPr>
+          <w:rFonts w:ascii="Averia Serif Libre" w:hAnsi="Averia Serif Libre"/>
+          <w:sz w:val="22"/>
+          <w:szCs w:val="22"/>
+        </w:rPr>
+        <w:t>Sandbr</w:t>
+      </w:r>
+      <w:proofErr w:type="spellEnd"/>
+      <w:r>
+        <w:rPr>
+          <w:rFonts w:ascii="Averia Serif Libre" w:hAnsi="Averia Serif Libre"/>
+          <w:sz w:val="22"/>
+          <w:szCs w:val="22"/>
+        </w:rPr>
+        <w:t xml:space="preserve"> não será responsável por qualquer uso inadequado da obra caso o artista não forneça essa notificação.</w:t>
       </w:r>
     </w:p>
     <w:p>
@@ -1875,8 +2053,20 @@
           <w:sz w:val="22"/>
           <w:szCs w:val="22"/>
         </w:rPr>
-        <w:t xml:space="preserve"> da Sandbr</w:t>
-      </w:r>
+        <w:t xml:space="preserve"> da </w:t>
+      </w:r>
+      <w:proofErr w:type="spellStart"/>
+      <w:r>
+        <w:rPr>
+          <w:rFonts w:ascii="Averia Serif Libre" w:hAnsi="Averia Serif Libre"/>
+          <w:b/>
+          <w:bCs/>
+          <w:sz w:val="22"/>
+          <w:szCs w:val="22"/>
+        </w:rPr>
+        <w:t>Sandbr</w:t>
+      </w:r>
+      <w:proofErr w:type="spellEnd"/>
     </w:p>
     <w:p>
       <w:pPr>
@@ -1937,7 +2127,25 @@
           <w:sz w:val="22"/>
           <w:szCs w:val="22"/>
         </w:rPr>
-        <w:t>A Sandbr declara que o Sr.</w:t>
+        <w:t xml:space="preserve">A </w:t>
+      </w:r>
+      <w:proofErr w:type="spellStart"/>
+      <w:r>
+        <w:rPr>
+          <w:rFonts w:ascii="Averia Serif Libre" w:hAnsi="Averia Serif Libre"/>
+          <w:sz w:val="22"/>
+          <w:szCs w:val="22"/>
+        </w:rPr>
+        <w:t>Sandbr</w:t>
+      </w:r>
+      <w:proofErr w:type="spellEnd"/>
+      <w:r>
+        <w:rPr>
+          <w:rFonts w:ascii="Averia Serif Libre" w:hAnsi="Averia Serif Libre"/>
+          <w:sz w:val="22"/>
+          <w:szCs w:val="22"/>
+        </w:rPr>
+        <w:t xml:space="preserve"> declara que o Sr.</w:t>
       </w:r>
       <w:r>
         <w:rPr>
@@ -2009,8 +2217,18 @@
           <w:sz w:val="22"/>
           <w:szCs w:val="22"/>
         </w:rPr>
-        <w:t xml:space="preserve"> responsável pela operação e gestão da Sandbr</w:t>
-      </w:r>
+        <w:t xml:space="preserve"> responsável pela operação e gestão da </w:t>
+      </w:r>
+      <w:proofErr w:type="spellStart"/>
+      <w:r>
+        <w:rPr>
+          <w:rFonts w:ascii="Averia Serif Libre" w:hAnsi="Averia Serif Libre"/>
+          <w:sz w:val="22"/>
+          <w:szCs w:val="22"/>
+        </w:rPr>
+        <w:t>Sandbr</w:t>
+      </w:r>
+      <w:proofErr w:type="spellEnd"/>
       <w:r>
         <w:rPr>
           <w:rFonts w:ascii="Averia Serif Libre" w:hAnsi="Averia Serif Libre"/>
@@ -2079,29 +2297,51 @@
           <w:sz w:val="22"/>
           <w:szCs w:val="22"/>
         </w:rPr>
-        <w:t>2. Responsabilidade da Sandbr</w:t>
-      </w:r>
-    </w:p>
-    <w:p>
-      <w:pPr>
-        <w:tabs>
-          <w:tab w:val="left" w:pos="5445"/>
-        </w:tabs>
-        <w:spacing w:after="0" w:line="240" w:lineRule="auto"/>
-        <w:rPr>
-          <w:rFonts w:ascii="Averia Serif Libre" w:hAnsi="Averia Serif Libre"/>
-          <w:sz w:val="22"/>
-          <w:szCs w:val="22"/>
-        </w:rPr>
-      </w:pPr>
-      <w:r>
-        <w:rPr>
-          <w:rFonts w:ascii="Averia Serif Libre" w:hAnsi="Averia Serif Libre"/>
-          <w:sz w:val="22"/>
-          <w:szCs w:val="22"/>
-        </w:rPr>
-        <w:t>A Sandbr</w:t>
-      </w:r>
+        <w:t xml:space="preserve">2. Responsabilidade da </w:t>
+      </w:r>
+      <w:proofErr w:type="spellStart"/>
+      <w:r>
+        <w:rPr>
+          <w:rFonts w:ascii="Averia Serif Libre" w:hAnsi="Averia Serif Libre"/>
+          <w:b/>
+          <w:bCs/>
+          <w:sz w:val="22"/>
+          <w:szCs w:val="22"/>
+        </w:rPr>
+        <w:t>Sandbr</w:t>
+      </w:r>
+      <w:proofErr w:type="spellEnd"/>
+    </w:p>
+    <w:p>
+      <w:pPr>
+        <w:tabs>
+          <w:tab w:val="left" w:pos="5445"/>
+        </w:tabs>
+        <w:spacing w:after="0" w:line="240" w:lineRule="auto"/>
+        <w:rPr>
+          <w:rFonts w:ascii="Averia Serif Libre" w:hAnsi="Averia Serif Libre"/>
+          <w:sz w:val="22"/>
+          <w:szCs w:val="22"/>
+        </w:rPr>
+      </w:pPr>
+      <w:r>
+        <w:rPr>
+          <w:rFonts w:ascii="Averia Serif Libre" w:hAnsi="Averia Serif Libre"/>
+          <w:sz w:val="22"/>
+          <w:szCs w:val="22"/>
+        </w:rPr>
+        <w:t xml:space="preserve">A </w:t>
+      </w:r>
+      <w:proofErr w:type="spellStart"/>
+      <w:r>
+        <w:rPr>
+          <w:rFonts w:ascii="Averia Serif Libre" w:hAnsi="Averia Serif Libre"/>
+          <w:sz w:val="22"/>
+          <w:szCs w:val="22"/>
+        </w:rPr>
+        <w:t>Sandbr</w:t>
+      </w:r>
+      <w:proofErr w:type="spellEnd"/>
       <w:r>
         <w:rPr>
           <w:rFonts w:ascii="Averia Serif Libre" w:hAnsi="Averia Serif Libre"/>
@@ -2174,15 +2414,51 @@
           <w:sz w:val="22"/>
           <w:szCs w:val="22"/>
         </w:rPr>
-        <w:t>A Sandbr declara que estes</w:t>
-      </w:r>
-      <w:r>
-        <w:rPr>
-          <w:rFonts w:ascii="Averia Serif Libre" w:hAnsi="Averia Serif Libre"/>
-          <w:sz w:val="22"/>
-          <w:szCs w:val="22"/>
-        </w:rPr>
-        <w:t xml:space="preserve"> dados serão utilizados exclusivamente para os fins relacionados à submissão da obra e à comunicação sobre o processo de colaboração. A Sandbr não compartilhará, venderá ou divulgará os dados pessoais do artista a terceiros sem o consentimento prévio, exceto em casos </w:t>
+        <w:t xml:space="preserve">A </w:t>
+      </w:r>
+      <w:proofErr w:type="spellStart"/>
+      <w:r>
+        <w:rPr>
+          <w:rFonts w:ascii="Averia Serif Libre" w:hAnsi="Averia Serif Libre"/>
+          <w:sz w:val="22"/>
+          <w:szCs w:val="22"/>
+        </w:rPr>
+        <w:t>Sandbr</w:t>
+      </w:r>
+      <w:proofErr w:type="spellEnd"/>
+      <w:r>
+        <w:rPr>
+          <w:rFonts w:ascii="Averia Serif Libre" w:hAnsi="Averia Serif Libre"/>
+          <w:sz w:val="22"/>
+          <w:szCs w:val="22"/>
+        </w:rPr>
+        <w:t xml:space="preserve"> declara que estes</w:t>
+      </w:r>
+      <w:r>
+        <w:rPr>
+          <w:rFonts w:ascii="Averia Serif Libre" w:hAnsi="Averia Serif Libre"/>
+          <w:sz w:val="22"/>
+          <w:szCs w:val="22"/>
+        </w:rPr>
+        <w:t xml:space="preserve"> dados serão utilizados exclusivamente para os fins relacionados à submissão da obra e à comunicação sobre o processo de colaboração. A </w:t>
+      </w:r>
+      <w:proofErr w:type="spellStart"/>
+      <w:r>
+        <w:rPr>
+          <w:rFonts w:ascii="Averia Serif Libre" w:hAnsi="Averia Serif Libre"/>
+          <w:sz w:val="22"/>
+          <w:szCs w:val="22"/>
+        </w:rPr>
+        <w:t>Sandbr</w:t>
+      </w:r>
+      <w:proofErr w:type="spellEnd"/>
+      <w:r>
+        <w:rPr>
+          <w:rFonts w:ascii="Averia Serif Libre" w:hAnsi="Averia Serif Libre"/>
+          <w:sz w:val="22"/>
+          <w:szCs w:val="22"/>
+        </w:rPr>
+        <w:t xml:space="preserve"> não compartilhará, venderá ou divulgará os dados pessoais do artista a terceiros sem o consentimento prévio, exceto em casos </w:t>
       </w:r>
       <w:r>
         <w:rPr>
@@ -2344,7 +2620,25 @@
           <w:sz w:val="22"/>
           <w:szCs w:val="22"/>
         </w:rPr>
-        <w:t xml:space="preserve"> Sandbr </w:t>
+        <w:t xml:space="preserve"> </w:t>
+      </w:r>
+      <w:proofErr w:type="spellStart"/>
+      <w:r>
+        <w:rPr>
+          <w:rFonts w:ascii="Averia Serif Libre" w:hAnsi="Averia Serif Libre"/>
+          <w:sz w:val="22"/>
+          <w:szCs w:val="22"/>
+        </w:rPr>
+        <w:t>Sandbr</w:t>
+      </w:r>
+      <w:proofErr w:type="spellEnd"/>
+      <w:r>
+        <w:rPr>
+          <w:rFonts w:ascii="Averia Serif Libre" w:hAnsi="Averia Serif Libre"/>
+          <w:sz w:val="22"/>
+          <w:szCs w:val="22"/>
+        </w:rPr>
+        <w:t xml:space="preserve"> </w:t>
       </w:r>
       <w:r>
         <w:rPr>
@@ -2360,7 +2654,25 @@
           <w:sz w:val="22"/>
           <w:szCs w:val="22"/>
         </w:rPr>
-        <w:t>seja descontinuada ou deixe de operar, todos os dados fornecidos pelos artistas, incluindo informações pessoais e obras enviadas, serão excluídos de nossos registros. A plataforma se compromete a realizar a exclusão de todos os dados armazenados de forma segura e irreversível, garantindo que nenhuma informação do artista seja mantida após a descontinuação. A Sandbr tomará as medidas necessárias para assegurar que todos os dados sejam removidos de seus sistemas, servidores ou qualquer outra forma de armazenamento utilizado para a operação do site.</w:t>
+        <w:t xml:space="preserve">seja descontinuada ou deixe de operar, todos os dados fornecidos pelos artistas, incluindo informações pessoais e obras enviadas, serão excluídos de nossos registros. A plataforma se compromete a realizar a exclusão de todos os dados armazenados de forma segura e irreversível, garantindo que nenhuma informação do artista seja mantida após a descontinuação. A </w:t>
+      </w:r>
+      <w:proofErr w:type="spellStart"/>
+      <w:r>
+        <w:rPr>
+          <w:rFonts w:ascii="Averia Serif Libre" w:hAnsi="Averia Serif Libre"/>
+          <w:sz w:val="22"/>
+          <w:szCs w:val="22"/>
+        </w:rPr>
+        <w:t>Sandbr</w:t>
+      </w:r>
+      <w:proofErr w:type="spellEnd"/>
+      <w:r>
+        <w:rPr>
+          <w:rFonts w:ascii="Averia Serif Libre" w:hAnsi="Averia Serif Libre"/>
+          <w:sz w:val="22"/>
+          <w:szCs w:val="22"/>
+        </w:rPr>
+        <w:t xml:space="preserve"> tomará as medidas necessárias para assegurar que todos os dados sejam removidos de seus sistemas, servidores ou qualquer outra forma de armazenamento utilizado para a operação do site.</w:t>
       </w:r>
     </w:p>
     <w:p>
@@ -2439,13 +2751,23 @@
         </w:rPr>
         <w:t xml:space="preserve">A </w:t>
       </w:r>
-      <w:r>
-        <w:rPr>
-          <w:rFonts w:ascii="Averia Serif Libre" w:hAnsi="Averia Serif Libre"/>
-          <w:sz w:val="22"/>
-          <w:szCs w:val="22"/>
-        </w:rPr>
-        <w:t>Sandbr declar</w:t>
+      <w:proofErr w:type="spellStart"/>
+      <w:r>
+        <w:rPr>
+          <w:rFonts w:ascii="Averia Serif Libre" w:hAnsi="Averia Serif Libre"/>
+          <w:sz w:val="22"/>
+          <w:szCs w:val="22"/>
+        </w:rPr>
+        <w:t>Sandbr</w:t>
+      </w:r>
+      <w:proofErr w:type="spellEnd"/>
+      <w:r>
+        <w:rPr>
+          <w:rFonts w:ascii="Averia Serif Libre" w:hAnsi="Averia Serif Libre"/>
+          <w:sz w:val="22"/>
+          <w:szCs w:val="22"/>
+        </w:rPr>
+        <w:t xml:space="preserve"> declar</w:t>
       </w:r>
       <w:r>
         <w:rPr>
@@ -2511,41 +2833,113 @@
           <w:sz w:val="22"/>
           <w:szCs w:val="22"/>
         </w:rPr>
-        <w:t>A Sandbr compromete-se a respeitar os termos dessa licença para todas as obras que, por qualquer motivo, não possuam uma licença explícita fornecida pelo artista. Isso implica que a obra será disponibilizada no site da Sandbr para fins não comerciais, com a devida atribuição ao autor, e sem que modificações ou derivações possam ser feitas. A responsabilidade de garantir que o licenciamento seja realizado conforme as preferências do artista é da Sandbr, desde que o artista não tenha especificado outra licença.</w:t>
-      </w:r>
-    </w:p>
-    <w:p>
-      <w:pPr>
-        <w:tabs>
-          <w:tab w:val="left" w:pos="5445"/>
-        </w:tabs>
-        <w:spacing w:after="0" w:line="240" w:lineRule="auto"/>
-        <w:rPr>
-          <w:rFonts w:ascii="Averia Serif Libre" w:hAnsi="Averia Serif Libre"/>
-          <w:sz w:val="22"/>
-          <w:szCs w:val="22"/>
-        </w:rPr>
-      </w:pPr>
-    </w:p>
-    <w:p>
-      <w:pPr>
-        <w:tabs>
-          <w:tab w:val="left" w:pos="5445"/>
-        </w:tabs>
-        <w:spacing w:after="0" w:line="240" w:lineRule="auto"/>
-        <w:rPr>
-          <w:rFonts w:ascii="Averia Serif Libre" w:hAnsi="Averia Serif Libre"/>
-          <w:sz w:val="22"/>
-          <w:szCs w:val="22"/>
-        </w:rPr>
-      </w:pPr>
-      <w:r>
-        <w:rPr>
-          <w:rFonts w:ascii="Averia Serif Libre" w:hAnsi="Averia Serif Libre"/>
-          <w:sz w:val="22"/>
-          <w:szCs w:val="22"/>
-        </w:rPr>
-        <w:t>Caso o artista deseje alterar a licença atribuída ou fazer ajustes no licenciamento de sua obra, ele poderá solicitar isso diretamente, conforme os procedimentos estabelecidos pela Sandbr, e a alteração será implementada de maneira imediata, desde que não conflite com outras obrigações legais.</w:t>
+        <w:t xml:space="preserve">A </w:t>
+      </w:r>
+      <w:proofErr w:type="spellStart"/>
+      <w:r>
+        <w:rPr>
+          <w:rFonts w:ascii="Averia Serif Libre" w:hAnsi="Averia Serif Libre"/>
+          <w:sz w:val="22"/>
+          <w:szCs w:val="22"/>
+        </w:rPr>
+        <w:t>Sandbr</w:t>
+      </w:r>
+      <w:proofErr w:type="spellEnd"/>
+      <w:r>
+        <w:rPr>
+          <w:rFonts w:ascii="Averia Serif Libre" w:hAnsi="Averia Serif Libre"/>
+          <w:sz w:val="22"/>
+          <w:szCs w:val="22"/>
+        </w:rPr>
+        <w:t xml:space="preserve"> compromete-se a respeitar os termos dessa licença para todas as obras que, por qualquer motivo, não possuam uma licença explícita fornecida pelo artista. Isso implica que a obra será disponibilizada no site da </w:t>
+      </w:r>
+      <w:proofErr w:type="spellStart"/>
+      <w:r>
+        <w:rPr>
+          <w:rFonts w:ascii="Averia Serif Libre" w:hAnsi="Averia Serif Libre"/>
+          <w:sz w:val="22"/>
+          <w:szCs w:val="22"/>
+        </w:rPr>
+        <w:t>Sandbr</w:t>
+      </w:r>
+      <w:proofErr w:type="spellEnd"/>
+      <w:r>
+        <w:rPr>
+          <w:rFonts w:ascii="Averia Serif Libre" w:hAnsi="Averia Serif Libre"/>
+          <w:sz w:val="22"/>
+          <w:szCs w:val="22"/>
+        </w:rPr>
+        <w:t xml:space="preserve"> para fins não comerciais, com a devida atribuição ao autor, e sem que modificações ou derivações possam ser feitas. A responsabilidade de garantir que o licenciamento seja realizado conforme as preferências do artista é da </w:t>
+      </w:r>
+      <w:proofErr w:type="spellStart"/>
+      <w:r>
+        <w:rPr>
+          <w:rFonts w:ascii="Averia Serif Libre" w:hAnsi="Averia Serif Libre"/>
+          <w:sz w:val="22"/>
+          <w:szCs w:val="22"/>
+        </w:rPr>
+        <w:t>Sandbr</w:t>
+      </w:r>
+      <w:proofErr w:type="spellEnd"/>
+      <w:r>
+        <w:rPr>
+          <w:rFonts w:ascii="Averia Serif Libre" w:hAnsi="Averia Serif Libre"/>
+          <w:sz w:val="22"/>
+          <w:szCs w:val="22"/>
+        </w:rPr>
+        <w:t>, desde que o artista não tenha especificado outra licença.</w:t>
+      </w:r>
+    </w:p>
+    <w:p>
+      <w:pPr>
+        <w:tabs>
+          <w:tab w:val="left" w:pos="5445"/>
+        </w:tabs>
+        <w:spacing w:after="0" w:line="240" w:lineRule="auto"/>
+        <w:rPr>
+          <w:rFonts w:ascii="Averia Serif Libre" w:hAnsi="Averia Serif Libre"/>
+          <w:sz w:val="22"/>
+          <w:szCs w:val="22"/>
+        </w:rPr>
+      </w:pPr>
+    </w:p>
+    <w:p>
+      <w:pPr>
+        <w:tabs>
+          <w:tab w:val="left" w:pos="5445"/>
+        </w:tabs>
+        <w:spacing w:after="0" w:line="240" w:lineRule="auto"/>
+        <w:rPr>
+          <w:rFonts w:ascii="Averia Serif Libre" w:hAnsi="Averia Serif Libre"/>
+          <w:sz w:val="22"/>
+          <w:szCs w:val="22"/>
+        </w:rPr>
+      </w:pPr>
+      <w:r>
+        <w:rPr>
+          <w:rFonts w:ascii="Averia Serif Libre" w:hAnsi="Averia Serif Libre"/>
+          <w:sz w:val="22"/>
+          <w:szCs w:val="22"/>
+        </w:rPr>
+        <w:t xml:space="preserve">Caso o artista deseje alterar a licença atribuída ou fazer ajustes no licenciamento de sua obra, ele poderá solicitar isso diretamente, conforme os procedimentos estabelecidos pela </w:t>
+      </w:r>
+      <w:proofErr w:type="spellStart"/>
+      <w:r>
+        <w:rPr>
+          <w:rFonts w:ascii="Averia Serif Libre" w:hAnsi="Averia Serif Libre"/>
+          <w:sz w:val="22"/>
+          <w:szCs w:val="22"/>
+        </w:rPr>
+        <w:t>Sandbr</w:t>
+      </w:r>
+      <w:proofErr w:type="spellEnd"/>
+      <w:r>
+        <w:rPr>
+          <w:rFonts w:ascii="Averia Serif Libre" w:hAnsi="Averia Serif Libre"/>
+          <w:sz w:val="22"/>
+          <w:szCs w:val="22"/>
+        </w:rPr>
+        <w:t>, e a alteração será implementada de maneira imediata, desde que não conflite com outras obrigações legais.</w:t>
       </w:r>
     </w:p>
     <w:p>
@@ -2654,7 +3048,25 @@
           <w:sz w:val="22"/>
           <w:szCs w:val="22"/>
         </w:rPr>
-        <w:t>], declaro que li, entendi e aceito os termos e condições de submissão de obras para a Sandbr, incluindo as cláusulas de licenciamento</w:t>
+        <w:t xml:space="preserve">], declaro que li, entendi e aceito os termos e condições de submissão de obras para a </w:t>
+      </w:r>
+      <w:proofErr w:type="spellStart"/>
+      <w:r>
+        <w:rPr>
+          <w:rFonts w:ascii="Averia Serif Libre" w:hAnsi="Averia Serif Libre"/>
+          <w:sz w:val="22"/>
+          <w:szCs w:val="22"/>
+        </w:rPr>
+        <w:t>Sandbr</w:t>
+      </w:r>
+      <w:proofErr w:type="spellEnd"/>
+      <w:r>
+        <w:rPr>
+          <w:rFonts w:ascii="Averia Serif Libre" w:hAnsi="Averia Serif Libre"/>
+          <w:sz w:val="22"/>
+          <w:szCs w:val="22"/>
+        </w:rPr>
+        <w:t>, incluindo as cláusulas de licenciamento</w:t>
       </w:r>
       <w:r>
         <w:rPr>
@@ -2678,8 +3090,18 @@
           <w:sz w:val="22"/>
           <w:szCs w:val="22"/>
         </w:rPr>
-        <w:t>; assim como os deveres, tanto os meus quanto os da Sandbr</w:t>
-      </w:r>
+        <w:t xml:space="preserve">; assim como os deveres, tanto os meus quanto os da </w:t>
+      </w:r>
+      <w:proofErr w:type="spellStart"/>
+      <w:r>
+        <w:rPr>
+          <w:rFonts w:ascii="Averia Serif Libre" w:hAnsi="Averia Serif Libre"/>
+          <w:sz w:val="22"/>
+          <w:szCs w:val="22"/>
+        </w:rPr>
+        <w:t>Sandbr</w:t>
+      </w:r>
+      <w:proofErr w:type="spellEnd"/>
       <w:r>
         <w:rPr>
           <w:rFonts w:ascii="Averia Serif Libre" w:hAnsi="Averia Serif Libre"/>
@@ -2744,7 +3166,25 @@
           <w:sz w:val="22"/>
           <w:szCs w:val="22"/>
         </w:rPr>
-        <w:t xml:space="preserve"> à Sandbr.</w:t>
+        <w:t xml:space="preserve"> à </w:t>
+      </w:r>
+      <w:proofErr w:type="spellStart"/>
+      <w:r>
+        <w:rPr>
+          <w:rFonts w:ascii="Averia Serif Libre" w:hAnsi="Averia Serif Libre"/>
+          <w:sz w:val="22"/>
+          <w:szCs w:val="22"/>
+        </w:rPr>
+        <w:t>Sandbr</w:t>
+      </w:r>
+      <w:proofErr w:type="spellEnd"/>
+      <w:r>
+        <w:rPr>
+          <w:rFonts w:ascii="Averia Serif Libre" w:hAnsi="Averia Serif Libre"/>
+          <w:sz w:val="22"/>
+          <w:szCs w:val="22"/>
+        </w:rPr>
+        <w:t>.</w:t>
       </w:r>
     </w:p>
     <w:p>
@@ -3035,6 +3475,19 @@
           <w:tab w:val="left" w:pos="5445"/>
         </w:tabs>
         <w:spacing w:after="0" w:line="240" w:lineRule="auto"/>
+        <w:rPr>
+          <w:rFonts w:ascii="Averia Serif Libre" w:hAnsi="Averia Serif Libre"/>
+          <w:sz w:val="22"/>
+          <w:szCs w:val="22"/>
+        </w:rPr>
+      </w:pPr>
+    </w:p>
+    <w:p>
+      <w:pPr>
+        <w:tabs>
+          <w:tab w:val="left" w:pos="5445"/>
+        </w:tabs>
+        <w:spacing w:after="0" w:line="240" w:lineRule="auto"/>
         <w:jc w:val="center"/>
         <w:rPr>
           <w:rFonts w:ascii="Averia Serif Libre" w:hAnsi="Averia Serif Libre"/>
@@ -3063,32 +3516,18 @@
           <w:tab w:val="left" w:pos="5445"/>
         </w:tabs>
         <w:spacing w:after="0" w:line="240" w:lineRule="auto"/>
-        <w:jc w:val="center"/>
-        <w:rPr>
-          <w:rFonts w:ascii="Averia Serif Libre" w:hAnsi="Averia Serif Libre"/>
-          <w:sz w:val="22"/>
-          <w:szCs w:val="22"/>
-        </w:rPr>
-      </w:pPr>
-    </w:p>
-    <w:p>
-      <w:pPr>
-        <w:tabs>
-          <w:tab w:val="left" w:pos="5445"/>
-        </w:tabs>
-        <w:spacing w:after="0" w:line="240" w:lineRule="auto"/>
         <w:jc w:val="right"/>
         <w:rPr>
           <w:rFonts w:ascii="Averia Serif Libre" w:hAnsi="Averia Serif Libre"/>
-          <w:b/>
-          <w:bCs/>
-          <w:sz w:val="22"/>
-          <w:szCs w:val="22"/>
-        </w:rPr>
-      </w:pPr>
-      <w:r>
-        <w:rPr>
-          <w:rFonts w:ascii="Averia Serif Libre" w:hAnsi="Averia Serif Libre"/>
+          <w:color w:val="3A3A3A" w:themeColor="background2" w:themeShade="40"/>
+          <w:sz w:val="22"/>
+          <w:szCs w:val="22"/>
+        </w:rPr>
+      </w:pPr>
+      <w:r>
+        <w:rPr>
+          <w:rFonts w:ascii="Averia Serif Libre" w:hAnsi="Averia Serif Libre"/>
+          <w:color w:val="3A3A3A" w:themeColor="background2" w:themeShade="40"/>
           <w:sz w:val="22"/>
           <w:szCs w:val="22"/>
         </w:rPr>
@@ -3101,13 +3540,22 @@
             <w:rFonts w:ascii="Averia Serif Libre" w:hAnsi="Averia Serif Libre"/>
             <w:b/>
             <w:bCs/>
-            <w:color w:val="000000" w:themeColor="text1"/>
+            <w:color w:val="3A3A3A" w:themeColor="background2" w:themeShade="40"/>
             <w:sz w:val="22"/>
             <w:szCs w:val="22"/>
           </w:rPr>
           <w:t>Raavë Aires</w:t>
         </w:r>
       </w:hyperlink>
+      <w:r>
+        <w:rPr>
+          <w:rFonts w:ascii="Averia Serif Libre" w:hAnsi="Averia Serif Libre"/>
+          <w:color w:val="3A3A3A" w:themeColor="background2" w:themeShade="40"/>
+          <w:sz w:val="22"/>
+          <w:szCs w:val="22"/>
+        </w:rPr>
+        <w:t xml:space="preserve"> e está disponível</w:t>
+      </w:r>
     </w:p>
     <w:p>
       <w:pPr>
@@ -3118,55 +3566,116 @@
         <w:jc w:val="right"/>
         <w:rPr>
           <w:rFonts w:ascii="Averia Serif Libre" w:hAnsi="Averia Serif Libre"/>
-          <w:b/>
-          <w:bCs/>
-          <w:sz w:val="22"/>
-          <w:szCs w:val="22"/>
-        </w:rPr>
-      </w:pPr>
-      <w:r>
-        <w:rPr>
-          <w:rFonts w:ascii="Averia Serif Libre" w:hAnsi="Averia Serif Libre"/>
-          <w:sz w:val="22"/>
-          <w:szCs w:val="22"/>
-        </w:rPr>
-        <w:t xml:space="preserve"> e está disponível</w:t>
-      </w:r>
-      <w:r>
-        <w:rPr>
-          <w:rFonts w:ascii="Averia Serif Libre" w:hAnsi="Averia Serif Libre"/>
-          <w:sz w:val="22"/>
-          <w:szCs w:val="22"/>
-        </w:rPr>
-        <w:t xml:space="preserve"> em</w:t>
-      </w:r>
-      <w:r>
-        <w:rPr>
-          <w:rFonts w:ascii="Averia Serif Libre" w:hAnsi="Averia Serif Libre"/>
-          <w:sz w:val="22"/>
-          <w:szCs w:val="22"/>
-        </w:rPr>
-        <w:t xml:space="preserve"> sob a licença </w:t>
-      </w:r>
-      <w:r>
-        <w:rPr>
-          <w:rFonts w:ascii="Averia Serif Libre" w:hAnsi="Averia Serif Libre"/>
-          <w:b/>
-          <w:bCs/>
-          <w:sz w:val="22"/>
-          <w:szCs w:val="22"/>
-        </w:rPr>
-        <w:t xml:space="preserve">CC BY-NC-SA </w:t>
-      </w:r>
-      <w:r>
-        <w:rPr>
-          <w:rFonts w:ascii="Averia Serif Libre" w:hAnsi="Averia Serif Libre"/>
-          <w:b/>
-          <w:bCs/>
-          <w:sz w:val="22"/>
-          <w:szCs w:val="22"/>
-        </w:rPr>
-        <w:t>4.0 Internacional.</w:t>
+          <w:color w:val="3A3A3A" w:themeColor="background2" w:themeShade="40"/>
+          <w:sz w:val="22"/>
+          <w:szCs w:val="22"/>
+        </w:rPr>
+      </w:pPr>
+      <w:r>
+        <w:rPr>
+          <w:rFonts w:ascii="Averia Serif Libre" w:hAnsi="Averia Serif Libre"/>
+          <w:color w:val="3A3A3A" w:themeColor="background2" w:themeShade="40"/>
+          <w:sz w:val="22"/>
+          <w:szCs w:val="22"/>
+        </w:rPr>
+        <w:t xml:space="preserve">no </w:t>
+      </w:r>
+      <w:hyperlink r:id="rId11" w:history="1">
+        <w:r>
+          <w:rPr>
+            <w:rStyle w:val="Hyperlink"/>
+            <w:rFonts w:ascii="Averia Serif Libre" w:hAnsi="Averia Serif Libre"/>
+            <w:color w:val="3A3A3A" w:themeColor="background2" w:themeShade="40"/>
+            <w:sz w:val="22"/>
+            <w:szCs w:val="22"/>
+          </w:rPr>
+          <w:t>GitHub</w:t>
+        </w:r>
+      </w:hyperlink>
+      <w:r>
+        <w:rPr>
+          <w:rFonts w:ascii="Averia Serif Libre" w:hAnsi="Averia Serif Libre"/>
+          <w:color w:val="3A3A3A" w:themeColor="background2" w:themeShade="40"/>
+          <w:sz w:val="22"/>
+          <w:szCs w:val="22"/>
+        </w:rPr>
+        <w:t xml:space="preserve"> </w:t>
+      </w:r>
+      <w:r>
+        <w:rPr>
+          <w:rFonts w:ascii="Averia Serif Libre" w:hAnsi="Averia Serif Libre"/>
+          <w:color w:val="3A3A3A" w:themeColor="background2" w:themeShade="40"/>
+          <w:sz w:val="22"/>
+          <w:szCs w:val="22"/>
+        </w:rPr>
+        <w:t xml:space="preserve">e no </w:t>
+      </w:r>
+      <w:hyperlink r:id="rId12" w:history="1">
+        <w:proofErr w:type="spellStart"/>
+        <w:r>
+          <w:rPr>
+            <w:rStyle w:val="Hyperlink"/>
+            <w:rFonts w:ascii="Averia Serif Libre" w:hAnsi="Averia Serif Libre"/>
+            <w:color w:val="3A3A3A" w:themeColor="background2" w:themeShade="40"/>
+            <w:sz w:val="22"/>
+            <w:szCs w:val="22"/>
+          </w:rPr>
+          <w:t>Codeberg</w:t>
+        </w:r>
+        <w:proofErr w:type="spellEnd"/>
+      </w:hyperlink>
+      <w:r>
+        <w:rPr>
+          <w:rFonts w:ascii="Averia Serif Libre" w:hAnsi="Averia Serif Libre"/>
+          <w:color w:val="3A3A3A" w:themeColor="background2" w:themeShade="40"/>
+          <w:sz w:val="22"/>
+          <w:szCs w:val="22"/>
+        </w:rPr>
+        <w:t xml:space="preserve"> </w:t>
+      </w:r>
+      <w:r>
+        <w:rPr>
+          <w:rFonts w:ascii="Averia Serif Libre" w:hAnsi="Averia Serif Libre"/>
+          <w:color w:val="3A3A3A" w:themeColor="background2" w:themeShade="40"/>
+          <w:sz w:val="22"/>
+          <w:szCs w:val="22"/>
+        </w:rPr>
+        <w:t xml:space="preserve">sob a licença </w:t>
+      </w:r>
+      <w:hyperlink r:id="rId13" w:history="1">
+        <w:r>
+          <w:rPr>
+            <w:rStyle w:val="Hyperlink"/>
+            <w:rFonts w:ascii="Averia Serif Libre" w:hAnsi="Averia Serif Libre"/>
+            <w:b/>
+            <w:bCs/>
+            <w:color w:val="3A3A3A" w:themeColor="background2" w:themeShade="40"/>
+            <w:sz w:val="22"/>
+            <w:szCs w:val="22"/>
+          </w:rPr>
+          <w:t xml:space="preserve">CC BY-NC-SA </w:t>
+        </w:r>
+        <w:r>
+          <w:rPr>
+            <w:rStyle w:val="Hyperlink"/>
+            <w:rFonts w:ascii="Averia Serif Libre" w:hAnsi="Averia Serif Libre"/>
+            <w:b/>
+            <w:bCs/>
+            <w:color w:val="3A3A3A" w:themeColor="background2" w:themeShade="40"/>
+            <w:sz w:val="22"/>
+            <w:szCs w:val="22"/>
+          </w:rPr>
+          <w:t>4.0</w:t>
+        </w:r>
+      </w:hyperlink>
+      <w:r>
+        <w:rPr>
+          <w:rFonts w:ascii="Averia Serif Libre" w:hAnsi="Averia Serif Libre"/>
+          <w:color w:val="3A3A3A" w:themeColor="background2" w:themeShade="40"/>
+          <w:sz w:val="22"/>
+          <w:szCs w:val="22"/>
+        </w:rPr>
+        <w:t>.</w:t>
       </w:r>
     </w:p>
     <w:p>
@@ -3178,15 +3687,34 @@
         <w:jc w:val="right"/>
         <w:rPr>
           <w:rFonts w:ascii="Averia Serif Libre" w:hAnsi="Averia Serif Libre"/>
-          <w:sz w:val="22"/>
-          <w:szCs w:val="22"/>
-        </w:rPr>
-      </w:pPr>
-      <w:r>
-        <w:rPr>
-          <w:rFonts w:ascii="Averia Serif Libre" w:hAnsi="Averia Serif Libre"/>
-          <w:b/>
-          <w:bCs/>
+          <w:b/>
+          <w:bCs/>
+          <w:color w:val="3A3A3A" w:themeColor="background2" w:themeShade="40"/>
+          <w:sz w:val="22"/>
+          <w:szCs w:val="22"/>
+        </w:rPr>
+      </w:pPr>
+    </w:p>
+    <w:p>
+      <w:pPr>
+        <w:tabs>
+          <w:tab w:val="left" w:pos="5445"/>
+        </w:tabs>
+        <w:spacing w:after="0" w:line="240" w:lineRule="auto"/>
+        <w:jc w:val="right"/>
+        <w:rPr>
+          <w:rFonts w:ascii="Averia Serif Libre" w:hAnsi="Averia Serif Libre"/>
+          <w:color w:val="3A3A3A" w:themeColor="background2" w:themeShade="40"/>
+          <w:sz w:val="22"/>
+          <w:szCs w:val="22"/>
+        </w:rPr>
+      </w:pPr>
+      <w:r>
+        <w:rPr>
+          <w:rFonts w:ascii="Averia Serif Libre" w:hAnsi="Averia Serif Libre"/>
+          <w:b/>
+          <w:bCs/>
+          <w:color w:val="3A3A3A" w:themeColor="background2" w:themeShade="40"/>
           <w:sz w:val="22"/>
           <w:szCs w:val="22"/>
         </w:rPr>
@@ -3195,11 +3723,30 @@
       <w:r>
         <w:rPr>
           <w:rFonts w:ascii="Averia Serif Libre" w:hAnsi="Averia Serif Libre"/>
+          <w:color w:val="3A3A3A" w:themeColor="background2" w:themeShade="40"/>
           <w:sz w:val="22"/>
           <w:szCs w:val="22"/>
         </w:rPr>
         <w:t>: O usuário pode usar, modificar e distribuir o</w:t>
       </w:r>
+      <w:r>
+        <w:rPr>
+          <w:rFonts w:ascii="Averia Serif Libre" w:hAnsi="Averia Serif Libre"/>
+          <w:color w:val="3A3A3A" w:themeColor="background2" w:themeShade="40"/>
+          <w:sz w:val="22"/>
+          <w:szCs w:val="22"/>
+        </w:rPr>
+        <w:t xml:space="preserve"> </w:t>
+      </w:r>
+      <w:r>
+        <w:rPr>
+          <w:rFonts w:ascii="Averia Serif Libre" w:hAnsi="Averia Serif Libre"/>
+          <w:color w:val="3A3A3A" w:themeColor="background2" w:themeShade="40"/>
+          <w:sz w:val="22"/>
+          <w:szCs w:val="22"/>
+        </w:rPr>
+        <w:t>conteúdo</w:t>
+      </w:r>
     </w:p>
     <w:p>
       <w:pPr>
@@ -3210,23 +3757,26 @@
         <w:jc w:val="right"/>
         <w:rPr>
           <w:rFonts w:ascii="Averia Serif Libre" w:hAnsi="Averia Serif Libre"/>
-          <w:sz w:val="22"/>
-          <w:szCs w:val="22"/>
-        </w:rPr>
-      </w:pPr>
-      <w:r>
-        <w:rPr>
-          <w:rFonts w:ascii="Averia Serif Libre" w:hAnsi="Averia Serif Libre"/>
-          <w:sz w:val="22"/>
-          <w:szCs w:val="22"/>
-        </w:rPr>
-        <w:t xml:space="preserve">conteúdo desde que </w:t>
-      </w:r>
-      <w:r>
-        <w:rPr>
-          <w:rFonts w:ascii="Averia Serif Libre" w:hAnsi="Averia Serif Libre"/>
-          <w:b/>
-          <w:bCs/>
+          <w:color w:val="3A3A3A" w:themeColor="background2" w:themeShade="40"/>
+          <w:sz w:val="22"/>
+          <w:szCs w:val="22"/>
+        </w:rPr>
+      </w:pPr>
+      <w:r>
+        <w:rPr>
+          <w:rFonts w:ascii="Averia Serif Libre" w:hAnsi="Averia Serif Libre"/>
+          <w:color w:val="3A3A3A" w:themeColor="background2" w:themeShade="40"/>
+          <w:sz w:val="22"/>
+          <w:szCs w:val="22"/>
+        </w:rPr>
+        <w:t xml:space="preserve">desde que </w:t>
+      </w:r>
+      <w:r>
+        <w:rPr>
+          <w:rFonts w:ascii="Averia Serif Libre" w:hAnsi="Averia Serif Libre"/>
+          <w:b/>
+          <w:bCs/>
+          <w:color w:val="3A3A3A" w:themeColor="background2" w:themeShade="40"/>
           <w:sz w:val="22"/>
           <w:szCs w:val="22"/>
         </w:rPr>
@@ -3235,11 +3785,68 @@
       <w:r>
         <w:rPr>
           <w:rFonts w:ascii="Averia Serif Libre" w:hAnsi="Averia Serif Libre"/>
+          <w:color w:val="3A3A3A" w:themeColor="background2" w:themeShade="40"/>
           <w:sz w:val="22"/>
           <w:szCs w:val="22"/>
         </w:rPr>
         <w:t xml:space="preserve"> de autoria,</w:t>
       </w:r>
+      <w:r>
+        <w:rPr>
+          <w:rFonts w:ascii="Averia Serif Libre" w:hAnsi="Averia Serif Libre"/>
+          <w:color w:val="3A3A3A" w:themeColor="background2" w:themeShade="40"/>
+          <w:sz w:val="22"/>
+          <w:szCs w:val="22"/>
+        </w:rPr>
+        <w:t xml:space="preserve"> </w:t>
+      </w:r>
+      <w:r>
+        <w:rPr>
+          <w:rFonts w:ascii="Averia Serif Libre" w:hAnsi="Averia Serif Libre"/>
+          <w:color w:val="3A3A3A" w:themeColor="background2" w:themeShade="40"/>
+          <w:sz w:val="22"/>
+          <w:szCs w:val="22"/>
+        </w:rPr>
+        <w:t>c</w:t>
+      </w:r>
+      <w:r>
+        <w:rPr>
+          <w:rFonts w:ascii="Averia Serif Libre" w:hAnsi="Averia Serif Libre"/>
+          <w:color w:val="3A3A3A" w:themeColor="background2" w:themeShade="40"/>
+          <w:sz w:val="22"/>
+          <w:szCs w:val="22"/>
+        </w:rPr>
+        <w:t>omo</w:t>
+      </w:r>
+      <w:r>
+        <w:rPr>
+          <w:rFonts w:ascii="Averia Serif Libre" w:hAnsi="Averia Serif Libre"/>
+          <w:color w:val="3A3A3A" w:themeColor="background2" w:themeShade="40"/>
+          <w:sz w:val="22"/>
+          <w:szCs w:val="22"/>
+        </w:rPr>
+        <w:t xml:space="preserve"> </w:t>
+      </w:r>
+      <w:proofErr w:type="spellStart"/>
+      <w:r>
+        <w:rPr>
+          <w:rFonts w:ascii="Averia Serif Libre" w:hAnsi="Averia Serif Libre"/>
+          <w:color w:val="3A3A3A" w:themeColor="background2" w:themeShade="40"/>
+          <w:sz w:val="22"/>
+          <w:szCs w:val="22"/>
+        </w:rPr>
+        <w:t>infor</w:t>
+      </w:r>
+      <w:proofErr w:type="spellEnd"/>
+      <w:r>
+        <w:rPr>
+          <w:rFonts w:ascii="Averia Serif Libre" w:hAnsi="Averia Serif Libre"/>
+          <w:color w:val="3A3A3A" w:themeColor="background2" w:themeShade="40"/>
+          <w:sz w:val="22"/>
+          <w:szCs w:val="22"/>
+        </w:rPr>
+        <w:t>-</w:t>
+      </w:r>
     </w:p>
     <w:p>
       <w:pPr>
@@ -3257,30 +3864,16 @@
       <w:r>
         <w:rPr>
           <w:rFonts w:ascii="Averia Serif Libre" w:hAnsi="Averia Serif Libre"/>
-          <w:sz w:val="22"/>
-          <w:szCs w:val="22"/>
-        </w:rPr>
-        <w:t>c</w:t>
-      </w:r>
-      <w:r>
-        <w:rPr>
-          <w:rFonts w:ascii="Averia Serif Libre" w:hAnsi="Averia Serif Libre"/>
-          <w:sz w:val="22"/>
-          <w:szCs w:val="22"/>
-        </w:rPr>
-        <w:t>omo</w:t>
-      </w:r>
-      <w:r>
-        <w:rPr>
-          <w:rFonts w:ascii="Averia Serif Libre" w:hAnsi="Averia Serif Libre"/>
-          <w:sz w:val="22"/>
-          <w:szCs w:val="22"/>
-        </w:rPr>
-        <w:t xml:space="preserve"> informações</w:t>
-      </w:r>
-      <w:r>
-        <w:rPr>
-          <w:rFonts w:ascii="Averia Serif Libre" w:hAnsi="Averia Serif Libre"/>
+          <w:color w:val="3A3A3A" w:themeColor="background2" w:themeShade="40"/>
+          <w:sz w:val="22"/>
+          <w:szCs w:val="22"/>
+        </w:rPr>
+        <w:t>mações</w:t>
+      </w:r>
+      <w:r>
+        <w:rPr>
+          <w:rFonts w:ascii="Averia Serif Libre" w:hAnsi="Averia Serif Libre"/>
+          <w:color w:val="3A3A3A" w:themeColor="background2" w:themeShade="40"/>
           <w:sz w:val="22"/>
           <w:szCs w:val="22"/>
         </w:rPr>
@@ -3289,47 +3882,12 @@
       <w:r>
         <w:rPr>
           <w:rFonts w:ascii="Averia Serif Libre" w:hAnsi="Averia Serif Libre"/>
-          <w:sz w:val="22"/>
-          <w:szCs w:val="22"/>
-        </w:rPr>
-        <w:t xml:space="preserve"> de contato, e respeite as condições</w:t>
-      </w:r>
-    </w:p>
-    <w:p>
-      <w:pPr>
-        <w:tabs>
-          <w:tab w:val="left" w:pos="5445"/>
-        </w:tabs>
-        <w:spacing w:after="0" w:line="240" w:lineRule="auto"/>
-        <w:jc w:val="right"/>
-        <w:rPr>
-          <w:rFonts w:ascii="Averia Serif Libre" w:hAnsi="Averia Serif Libre"/>
-          <w:sz w:val="22"/>
-          <w:szCs w:val="22"/>
-        </w:rPr>
-      </w:pPr>
-      <w:r>
-        <w:rPr>
-          <w:rFonts w:ascii="Averia Serif Libre" w:hAnsi="Averia Serif Libre"/>
-          <w:sz w:val="22"/>
-          <w:szCs w:val="22"/>
-        </w:rPr>
-        <w:t xml:space="preserve"> dessa licença.</w:t>
-      </w:r>
-    </w:p>
-    <w:p>
-      <w:pPr>
-        <w:tabs>
-          <w:tab w:val="left" w:pos="5445"/>
-        </w:tabs>
-        <w:spacing w:after="0" w:line="240" w:lineRule="auto"/>
-        <w:jc w:val="right"/>
-        <w:rPr>
-          <w:rFonts w:ascii="Averia Serif Libre" w:hAnsi="Averia Serif Libre"/>
-          <w:sz w:val="22"/>
-          <w:szCs w:val="22"/>
-        </w:rPr>
-      </w:pPr>
+          <w:color w:val="3A3A3A" w:themeColor="background2" w:themeShade="40"/>
+          <w:sz w:val="22"/>
+          <w:szCs w:val="22"/>
+        </w:rPr>
+        <w:t xml:space="preserve"> de contato, e respeite as condições dessa licença.</w:t>
+      </w:r>
     </w:p>
     <w:sectPr>
       <w:pgSz w:w="11906" w:h="16838"/>

</xml_diff>